<commit_message>
Add category grouping for todos
</commit_message>
<xml_diff>
--- a/FSD.docx
+++ b/FSD.docx
@@ -15,14 +15,14 @@
         <w:rPr>
           <w:b/>
         </w:rPr>
-        <w:t>Version: 1.0.0</w:t>
+        <w:t>Version: 1.1.0</w:t>
         <w:br/>
       </w:r>
       <w:r>
         <w:rPr>
           <w:b/>
         </w:rPr>
-        <w:t>Date: May 26, 2026</w:t>
+        <w:t>Date: May 27, 2026</w:t>
         <w:br/>
       </w:r>
       <w:r>
@@ -51,6 +51,14 @@
     </w:p>
     <w:p>
       <w:pPr>
+        <w:spacing w:after="120"/>
+      </w:pPr>
+      <w:r>
+        <w:t>The current version supports task categories, grouped task presentation, and category-based filtering in addition to the existing status filters.</w:t>
+      </w:r>
+    </w:p>
+    <w:p>
+      <w:pPr>
         <w:pStyle w:val="Heading1"/>
       </w:pPr>
       <w:r>
@@ -63,6 +71,14 @@
       </w:pPr>
       <w:r>
         <w:t>The purpose of this project is to provide a lightweight, offline-capable task management application with a modern visual design and user-friendly interaction model. It should run in web browsers and remain usable on mobile devices without code changes.</w:t>
+      </w:r>
+    </w:p>
+    <w:p>
+      <w:pPr>
+        <w:spacing w:after="120"/>
+      </w:pPr>
+      <w:r>
+        <w:t>The category feature helps users organize tasks by domain, such as makanan, peralatan, pekerjaan, rumah, or any other free-text category.</w:t>
       </w:r>
     </w:p>
     <w:p>
@@ -83,6 +99,14 @@
     </w:p>
     <w:p>
       <w:pPr>
+        <w:spacing w:after="120"/>
+      </w:pPr>
+      <w:r>
+        <w:t>The scope includes task category creation through the add/edit task forms, grouped task display by category, and filtering the task list by a selected category.</w:t>
+      </w:r>
+    </w:p>
+    <w:p>
+      <w:pPr>
         <w:pStyle w:val="Heading1"/>
       </w:pPr>
       <w:r>
@@ -98,21 +122,29 @@
         <w:br/>
         <w:t>2. Optionally add task descriptions.</w:t>
         <w:br/>
-        <w:t>3. Optionally assign due dates.</w:t>
+        <w:t>3. Optionally assign a free-text category, for example makanan or peralatan.</w:t>
         <w:br/>
-        <w:t>4. Optionally set task priority as low, medium, or high.</w:t>
+        <w:t>4. Optionally assign due dates.</w:t>
         <w:br/>
-        <w:t>5. Mark tasks as completed or active.</w:t>
+        <w:t>5. Optionally set task priority as low, medium, or high.</w:t>
         <w:br/>
-        <w:t>6. Edit existing tasks.</w:t>
+        <w:t>6. Mark tasks as completed or active.</w:t>
         <w:br/>
-        <w:t>7. Delete tasks.</w:t>
+        <w:t>7. Edit existing tasks, including title, description, category, and due date.</w:t>
         <w:br/>
-        <w:t>8. Filter task list by All, Active, or Completed.</w:t>
+        <w:t>8. Delete tasks.</w:t>
         <w:br/>
-        <w:t>9. Display task statistics: active count, completed count, total count.</w:t>
+        <w:t>9. Filter task list by All, Active, or Completed.</w:t>
         <w:br/>
-        <w:t>10. Persist tasks locally in IndexedDB to survive page reloads and browser restarts.</w:t>
+        <w:t>10. Filter task list by category using automatically detected categories from existing tasks.</w:t>
+        <w:br/>
+        <w:t>11. Group visible tasks by category in the task list.</w:t>
+        <w:br/>
+        <w:t>12. Display uncategorized tasks under an Uncategorized group.</w:t>
+        <w:br/>
+        <w:t>13. Display task statistics: active count, completed count, total count.</w:t>
+        <w:br/>
+        <w:t>14. Persist tasks locally in IndexedDB to survive page reloads and browser restarts.</w:t>
       </w:r>
     </w:p>
     <w:p>
@@ -141,6 +173,8 @@
         <w:t>6. The application must compile successfully without errors.</w:t>
         <w:br/>
         <w:t>7. The UI must be accessible and support keyboard interactions.</w:t>
+        <w:br/>
+        <w:t>8. Category filtering and grouping must work without requiring a backend or fixed category table.</w:t>
       </w:r>
     </w:p>
     <w:p>
@@ -161,6 +195,14 @@
     </w:p>
     <w:p>
       <w:pPr>
+        <w:spacing w:after="120"/>
+      </w:pPr>
+      <w:r>
+        <w:t>App.tsx derives the available category list from the current Todo collection, stores the selected category filter, and passes the selected filter into TodoList. TodoList applies status and category filters, then groups visible tasks by category before rendering TodoItem components.</w:t>
+      </w:r>
+    </w:p>
+    <w:p>
+      <w:pPr>
         <w:pStyle w:val="Heading1"/>
       </w:pPr>
       <w:r>
@@ -174,13 +216,21 @@
       <w:r>
         <w:t>App</w:t>
         <w:br/>
-        <w:t>├── AddTodo</w:t>
+        <w:t>- AddTodo</w:t>
         <w:br/>
-        <w:t>├── TodoList</w:t>
+        <w:t>- Status Filters</w:t>
         <w:br/>
-        <w:t>│   ├── TodoItem</w:t>
+        <w:t>- Category Filter</w:t>
         <w:br/>
-        <w:t>└── Footer</w:t>
+        <w:t>- TodoList</w:t>
+        <w:br/>
+        <w:t xml:space="preserve">  - Category Group Header</w:t>
+        <w:br/>
+        <w:t xml:space="preserve">  - TodoItem</w:t>
+        <w:br/>
+        <w:t>- Clear Completed Button</w:t>
+        <w:br/>
+        <w:t>- Footer</w:t>
       </w:r>
     </w:p>
     <w:p>
@@ -206,6 +256,8 @@
         <w:br/>
         <w:t>- completed: boolean</w:t>
         <w:br/>
+        <w:t>- category: string (optional)</w:t>
+        <w:br/>
         <w:t>- dueDate: string (optional)</w:t>
         <w:br/>
         <w:t>- priority: low | medium | high</w:t>
@@ -213,6 +265,14 @@
         <w:t>- createdAt: number</w:t>
         <w:br/>
         <w:t>- updatedAt: number</w:t>
+      </w:r>
+    </w:p>
+    <w:p>
+      <w:pPr>
+        <w:spacing w:after="120"/>
+      </w:pPr>
+      <w:r>
+        <w:t>The category field is optional to preserve compatibility with existing tasks created before the category feature was added. Empty or missing category values are treated as Uncategorized in the UI.</w:t>
       </w:r>
     </w:p>
     <w:p>
@@ -233,6 +293,14 @@
     </w:p>
     <w:p>
       <w:pPr>
+        <w:spacing w:after="120"/>
+      </w:pPr>
+      <w:r>
+        <w:t>The category field is stored as part of each Todo record. Category filtering is currently performed in application state after tasks are loaded from IndexedDB, so no additional IndexedDB index is required for the current feature size.</w:t>
+      </w:r>
+    </w:p>
+    <w:p>
+      <w:pPr>
         <w:pStyle w:val="Heading1"/>
       </w:pPr>
       <w:r>
@@ -244,7 +312,15 @@
         <w:spacing w:after="120"/>
       </w:pPr>
       <w:r>
-        <w:t>The UI is built with responsive CSS and uses visual hierarchy, gradient backgrounds, card-style containers, buttons, and compact mobile styling. The expanded add-task form, status filters, and action buttons are designed for both desktop and mobile finger-friendly use.</w:t>
+        <w:t>The UI is built with responsive CSS and uses visual hierarchy, gradient backgrounds, card-style containers, buttons, and compact mobile styling. The expanded add-task form, status filters, category filter, group headers, and action buttons are designed for both desktop and mobile finger-friendly use.</w:t>
+      </w:r>
+    </w:p>
+    <w:p>
+      <w:pPr>
+        <w:spacing w:after="120"/>
+      </w:pPr>
+      <w:r>
+        <w:t>Category values are displayed as compact badges on task items. The task list displays a group header for each visible category and a count for the number of tasks in that category.</w:t>
       </w:r>
     </w:p>
     <w:p>
@@ -260,15 +336,49 @@
         <w:spacing w:after="120"/>
       </w:pPr>
       <w:r>
-        <w:t>1. Add Task: User enters a title and optional details, then submits the form.</w:t>
+        <w:t>1. Add Task: User enters a title and optional details, including category, then submits the form.</w:t>
         <w:br/>
-        <w:t>2. Edit Task: User clicks edit, modifies task fields, and saves changes.</w:t>
+        <w:t>2. Edit Task: User clicks edit, modifies task fields including category, and saves changes.</w:t>
         <w:br/>
         <w:t>3. Complete Task: User toggles the checkbox to mark task complete or active.</w:t>
         <w:br/>
         <w:t>4. Delete Task: User removes the task using the delete button.</w:t>
         <w:br/>
-        <w:t>5. Filter Tasks: User selects a filter button to display relevant tasks.</w:t>
+        <w:t>5. Filter by Status: User selects All, Active, or Completed to display relevant tasks.</w:t>
+        <w:br/>
+        <w:t>6. Filter by Category: User selects a category from the category dropdown to display tasks in that category.</w:t>
+        <w:br/>
+        <w:t>7. Group Tasks: The visible task list is automatically grouped by category.</w:t>
+        <w:br/>
+        <w:t>8. Clear Completed: User removes all completed tasks using the clear completed button.</w:t>
+      </w:r>
+    </w:p>
+    <w:p>
+      <w:pPr>
+        <w:pStyle w:val="Heading1"/>
+      </w:pPr>
+      <w:r>
+        <w:t>Category Filtering and Grouping Rules</w:t>
+      </w:r>
+    </w:p>
+    <w:p>
+      <w:pPr>
+        <w:spacing w:after="120"/>
+      </w:pPr>
+      <w:r>
+        <w:t>1. Categories are free-text values entered by the user.</w:t>
+        <w:br/>
+        <w:t>2. The category dropdown is generated from non-empty category values in the current task list.</w:t>
+        <w:br/>
+        <w:t>3. Selecting All Categories displays all visible tasks grouped by category.</w:t>
+        <w:br/>
+        <w:t>4. Selecting a specific category displays only tasks matching that category.</w:t>
+        <w:br/>
+        <w:t>5. Status filtering and category filtering are combined.</w:t>
+        <w:br/>
+        <w:t>6. Tasks without category values are grouped under Uncategorized.</w:t>
+        <w:br/>
+        <w:t>7. If a selected category no longer exists after edits or deletes, the application falls back to All Categories.</w:t>
       </w:r>
     </w:p>
     <w:p>
@@ -305,6 +415,8 @@
         <w:t>- PROJECT_DOCUMENTATION.md</w:t>
         <w:br/>
         <w:t>- GITHUB_SETUP.md</w:t>
+        <w:br/>
+        <w:t>- CODEX.md</w:t>
       </w:r>
     </w:p>
     <w:p>
@@ -336,7 +448,7 @@
         <w:spacing w:after="120"/>
       </w:pPr>
       <w:r>
-        <w:t>The application should be validated by running npm run build and confirming a successful production build. Functional validation includes verifying task creation, editing, deletion, filtering, and persistence after page reloads.</w:t>
+        <w:t>The application should be validated by running npm run lint and npm run build, then confirming a successful production build. Functional validation includes verifying task creation, editing, deletion, status filtering, category filtering, grouped category display, clear completed behavior, and persistence after page reloads.</w:t>
       </w:r>
     </w:p>
     <w:p>
@@ -352,7 +464,7 @@
         <w:spacing w:after="120"/>
       </w:pPr>
       <w:r>
-        <w:t>Potential future enhancements include: dark mode, task categories, recurring tasks, search capabilities, export/import functionality, cloud sync, drag and drop ordering, and notifications.</w:t>
+        <w:t>Potential future enhancements include: dark mode, recurring tasks, search capabilities, export/import functionality, cloud sync, drag and drop ordering, task notifications, and configurable category management.</w:t>
       </w:r>
     </w:p>
     <w:sectPr>

</xml_diff>